<commit_message>
fix: update weekly report template and adjust related logic
- Changed the template file name from `17 INTERNSHIP WEEKLY REPORT_2024.docx` to `16 PRACTICUM WEEKLY REPORT_2024.docx`.
- Reduced the number of weeks in the report from 7 to 5, updating the corresponding placeholders and logic in the weekly report controller.
- Enhanced the student weekly report component to reflect the new structure and added a success modal for saving reports.
- Updated the API routes to accommodate the new supervisor feedback and agency self-evaluation functionalities.
</commit_message>
<xml_diff>
--- a/server/src/templates/16 PRACTICUM WEEKLY REPORT_2024.docx
+++ b/server/src/templates/16 PRACTICUM WEEKLY REPORT_2024.docx
@@ -252,7 +252,7 @@
                 <w:sz w:val="16"/>
                 <w:szCs w:val="16"/>
               </w:rPr>
-              <w:t>JOASH IRVIN M. SANTOS</w:t>
+              <w:t>${student_name}</w:t>
             </w:r>
           </w:p>
         </w:tc>
@@ -320,7 +320,7 @@
                 <w:sz w:val="16"/>
                 <w:szCs w:val="16"/>
               </w:rPr>
-              <w:t>ENGR. KENNETH S. VIRAY</w:t>
+              <w:t>${instructor_name}</w:t>
             </w:r>
           </w:p>
         </w:tc>
@@ -388,7 +388,7 @@
                 <w:sz w:val="16"/>
                 <w:szCs w:val="16"/>
               </w:rPr>
-              <w:t>DEPARTMENT OF THE INTERIOR AND LOCAL GOVERNMENT - CORDILLERA</w:t>
+              <w:t>${company_name}</w:t>
             </w:r>
           </w:p>
         </w:tc>
@@ -460,6 +460,15 @@
                 <w:szCs w:val="16"/>
               </w:rPr>
             </w:pPr>
+            <w:r>
+              <w:rPr>
+                <w:rFonts w:ascii="Arial" w:eastAsia="Arial" w:hAnsi="Arial" w:cs="Arial"/>
+                <w:b/>
+                <w:sz w:val="16"/>
+                <w:szCs w:val="16"/>
+              </w:rPr>
+              <w:t>${job_description}</w:t>
+            </w:r>
           </w:p>
           <w:p>
             <w:pPr>
@@ -530,6 +539,15 @@
                 <w:szCs w:val="16"/>
               </w:rPr>
             </w:pPr>
+            <w:r>
+              <w:rPr>
+                <w:rFonts w:ascii="Arial" w:eastAsia="Arial" w:hAnsi="Arial" w:cs="Arial"/>
+                <w:b/>
+                <w:sz w:val="16"/>
+                <w:szCs w:val="16"/>
+              </w:rPr>
+              <w:t>${start_date}</w:t>
+            </w:r>
           </w:p>
         </w:tc>
       </w:tr>
@@ -589,6 +607,15 @@
                 <w:szCs w:val="16"/>
               </w:rPr>
             </w:pPr>
+            <w:r>
+              <w:rPr>
+                <w:rFonts w:ascii="Arial" w:eastAsia="Arial" w:hAnsi="Arial" w:cs="Arial"/>
+                <w:b/>
+                <w:sz w:val="16"/>
+                <w:szCs w:val="16"/>
+              </w:rPr>
+              <w:t>${end_date}</w:t>
+            </w:r>
           </w:p>
         </w:tc>
       </w:tr>
@@ -650,6 +677,15 @@
                 <w:szCs w:val="16"/>
               </w:rPr>
             </w:pPr>
+            <w:r>
+              <w:rPr>
+                <w:rFonts w:ascii="Arial" w:eastAsia="Arial" w:hAnsi="Arial" w:cs="Arial"/>
+                <w:b/>
+                <w:sz w:val="16"/>
+                <w:szCs w:val="16"/>
+              </w:rPr>
+              <w:t>${total_hours}</w:t>
+            </w:r>
           </w:p>
         </w:tc>
       </w:tr>
@@ -795,7 +831,23 @@
                 <w:szCs w:val="16"/>
               </w:rPr>
               <w:br/>
-              <w:t>(Dates of Coverage)</w:t>
+              <w:t>(</w:t>
+            </w:r>
+            <w:r>
+              <w:rPr>
+                <w:rFonts w:ascii="Arial" w:eastAsia="Arial" w:hAnsi="Arial" w:cs="Arial"/>
+                <w:sz w:val="16"/>
+                <w:szCs w:val="16"/>
+              </w:rPr>
+              <w:t>${week_1_date_range}</w:t>
+            </w:r>
+            <w:r>
+              <w:rPr>
+                <w:rFonts w:ascii="Arial" w:eastAsia="Arial" w:hAnsi="Arial" w:cs="Arial"/>
+                <w:sz w:val="16"/>
+                <w:szCs w:val="16"/>
+              </w:rPr>
+              <w:t>)</w:t>
             </w:r>
           </w:p>
         </w:tc>
@@ -815,6 +867,14 @@
                 <w:szCs w:val="16"/>
               </w:rPr>
             </w:pPr>
+            <w:r>
+              <w:rPr>
+                <w:rFonts w:ascii="Arial" w:eastAsia="Arial" w:hAnsi="Arial" w:cs="Arial"/>
+                <w:sz w:val="16"/>
+                <w:szCs w:val="16"/>
+              </w:rPr>
+              <w:t>${week_1_tasks}</w:t>
+            </w:r>
           </w:p>
         </w:tc>
         <w:tc>
@@ -835,6 +895,14 @@
                 <w:szCs w:val="16"/>
               </w:rPr>
             </w:pPr>
+            <w:r>
+              <w:rPr>
+                <w:rFonts w:ascii="Arial" w:eastAsia="Arial" w:hAnsi="Arial" w:cs="Arial"/>
+                <w:sz w:val="16"/>
+                <w:szCs w:val="16"/>
+              </w:rPr>
+              <w:t>${week_1_learned}</w:t>
+            </w:r>
           </w:p>
         </w:tc>
       </w:tr>
@@ -877,7 +945,23 @@
                 <w:szCs w:val="16"/>
               </w:rPr>
               <w:br/>
-              <w:t>(Dates of Coverage)</w:t>
+              <w:t>(</w:t>
+            </w:r>
+            <w:r>
+              <w:rPr>
+                <w:rFonts w:ascii="Arial" w:eastAsia="Arial" w:hAnsi="Arial" w:cs="Arial"/>
+                <w:sz w:val="16"/>
+                <w:szCs w:val="16"/>
+              </w:rPr>
+              <w:t>${week_2_date_range}</w:t>
+            </w:r>
+            <w:r>
+              <w:rPr>
+                <w:rFonts w:ascii="Arial" w:eastAsia="Arial" w:hAnsi="Arial" w:cs="Arial"/>
+                <w:sz w:val="16"/>
+                <w:szCs w:val="16"/>
+              </w:rPr>
+              <w:t>)</w:t>
             </w:r>
           </w:p>
         </w:tc>
@@ -897,6 +981,14 @@
                 <w:szCs w:val="16"/>
               </w:rPr>
             </w:pPr>
+            <w:r>
+              <w:rPr>
+                <w:rFonts w:ascii="Arial" w:eastAsia="Arial" w:hAnsi="Arial" w:cs="Arial"/>
+                <w:sz w:val="16"/>
+                <w:szCs w:val="16"/>
+              </w:rPr>
+              <w:t>${week_2_tasks}</w:t>
+            </w:r>
           </w:p>
         </w:tc>
         <w:tc>
@@ -917,6 +1009,14 @@
                 <w:szCs w:val="16"/>
               </w:rPr>
             </w:pPr>
+            <w:r>
+              <w:rPr>
+                <w:rFonts w:ascii="Arial" w:eastAsia="Arial" w:hAnsi="Arial" w:cs="Arial"/>
+                <w:sz w:val="16"/>
+                <w:szCs w:val="16"/>
+              </w:rPr>
+              <w:t>${week_2_learned}</w:t>
+            </w:r>
           </w:p>
         </w:tc>
       </w:tr>
@@ -959,7 +1059,23 @@
                 <w:szCs w:val="16"/>
               </w:rPr>
               <w:br/>
-              <w:t>(Dates of Coverage)</w:t>
+              <w:t>(</w:t>
+            </w:r>
+            <w:r>
+              <w:rPr>
+                <w:rFonts w:ascii="Arial" w:eastAsia="Arial" w:hAnsi="Arial" w:cs="Arial"/>
+                <w:sz w:val="16"/>
+                <w:szCs w:val="16"/>
+              </w:rPr>
+              <w:t>${week_3_date_range}</w:t>
+            </w:r>
+            <w:r>
+              <w:rPr>
+                <w:rFonts w:ascii="Arial" w:eastAsia="Arial" w:hAnsi="Arial" w:cs="Arial"/>
+                <w:sz w:val="16"/>
+                <w:szCs w:val="16"/>
+              </w:rPr>
+              <w:t>)</w:t>
             </w:r>
           </w:p>
         </w:tc>
@@ -979,6 +1095,14 @@
                 <w:szCs w:val="16"/>
               </w:rPr>
             </w:pPr>
+            <w:r>
+              <w:rPr>
+                <w:rFonts w:ascii="Arial" w:eastAsia="Arial" w:hAnsi="Arial" w:cs="Arial"/>
+                <w:sz w:val="16"/>
+                <w:szCs w:val="16"/>
+              </w:rPr>
+              <w:t>${week_3_tasks}</w:t>
+            </w:r>
           </w:p>
         </w:tc>
         <w:tc>
@@ -999,6 +1123,14 @@
                 <w:szCs w:val="16"/>
               </w:rPr>
             </w:pPr>
+            <w:r>
+              <w:rPr>
+                <w:rFonts w:ascii="Arial" w:eastAsia="Arial" w:hAnsi="Arial" w:cs="Arial"/>
+                <w:sz w:val="16"/>
+                <w:szCs w:val="16"/>
+              </w:rPr>
+              <w:t>${week_3_learned}</w:t>
+            </w:r>
           </w:p>
         </w:tc>
       </w:tr>
@@ -1041,7 +1173,23 @@
                 <w:szCs w:val="16"/>
               </w:rPr>
               <w:br/>
-              <w:t>(Dates of Coverage)</w:t>
+              <w:t>(</w:t>
+            </w:r>
+            <w:r>
+              <w:rPr>
+                <w:rFonts w:ascii="Arial" w:eastAsia="Arial" w:hAnsi="Arial" w:cs="Arial"/>
+                <w:sz w:val="16"/>
+                <w:szCs w:val="16"/>
+              </w:rPr>
+              <w:t>${week_4_date_range}</w:t>
+            </w:r>
+            <w:r>
+              <w:rPr>
+                <w:rFonts w:ascii="Arial" w:eastAsia="Arial" w:hAnsi="Arial" w:cs="Arial"/>
+                <w:sz w:val="16"/>
+                <w:szCs w:val="16"/>
+              </w:rPr>
+              <w:t>)</w:t>
             </w:r>
           </w:p>
         </w:tc>
@@ -1061,6 +1209,14 @@
                 <w:szCs w:val="16"/>
               </w:rPr>
             </w:pPr>
+            <w:r>
+              <w:rPr>
+                <w:rFonts w:ascii="Arial" w:eastAsia="Arial" w:hAnsi="Arial" w:cs="Arial"/>
+                <w:sz w:val="16"/>
+                <w:szCs w:val="16"/>
+              </w:rPr>
+              <w:t>${week_4_tasks}</w:t>
+            </w:r>
           </w:p>
         </w:tc>
         <w:tc>
@@ -1081,6 +1237,14 @@
                 <w:szCs w:val="16"/>
               </w:rPr>
             </w:pPr>
+            <w:r>
+              <w:rPr>
+                <w:rFonts w:ascii="Arial" w:eastAsia="Arial" w:hAnsi="Arial" w:cs="Arial"/>
+                <w:sz w:val="16"/>
+                <w:szCs w:val="16"/>
+              </w:rPr>
+              <w:t>${week_4_learned}</w:t>
+            </w:r>
           </w:p>
         </w:tc>
       </w:tr>
@@ -1109,6 +1273,48 @@
                 <w:szCs w:val="16"/>
               </w:rPr>
             </w:pPr>
+            <w:r>
+              <w:rPr>
+                <w:rFonts w:ascii="Arial" w:eastAsia="Arial" w:hAnsi="Arial" w:cs="Arial"/>
+                <w:sz w:val="16"/>
+                <w:szCs w:val="16"/>
+              </w:rPr>
+              <w:t>Week 5</w:t>
+            </w:r>
+          </w:p>
+          <w:p>
+            <w:pPr>
+              <w:spacing w:after="0" w:line="240" w:lineRule="auto"/>
+              <w:rPr>
+                <w:rFonts w:ascii="Arial" w:eastAsia="Arial" w:hAnsi="Arial" w:cs="Arial"/>
+                <w:sz w:val="16"/>
+                <w:szCs w:val="16"/>
+              </w:rPr>
+            </w:pPr>
+            <w:r>
+              <w:rPr>
+                <w:rFonts w:ascii="Arial" w:eastAsia="Arial" w:hAnsi="Arial" w:cs="Arial"/>
+                <w:sz w:val="16"/>
+                <w:szCs w:val="16"/>
+              </w:rPr>
+              <w:t>(</w:t>
+            </w:r>
+            <w:r>
+              <w:rPr>
+                <w:rFonts w:ascii="Arial" w:eastAsia="Arial" w:hAnsi="Arial" w:cs="Arial"/>
+                <w:sz w:val="16"/>
+                <w:szCs w:val="16"/>
+              </w:rPr>
+              <w:t>${week_5_date_range}</w:t>
+            </w:r>
+            <w:r>
+              <w:rPr>
+                <w:rFonts w:ascii="Arial" w:eastAsia="Arial" w:hAnsi="Arial" w:cs="Arial"/>
+                <w:sz w:val="16"/>
+                <w:szCs w:val="16"/>
+              </w:rPr>
+              <w:t>)</w:t>
+            </w:r>
           </w:p>
         </w:tc>
         <w:tc>
@@ -1130,6 +1336,14 @@
                 <w:szCs w:val="16"/>
               </w:rPr>
             </w:pPr>
+            <w:r>
+              <w:rPr>
+                <w:rFonts w:ascii="Arial" w:eastAsia="Arial" w:hAnsi="Arial" w:cs="Arial"/>
+                <w:sz w:val="16"/>
+                <w:szCs w:val="16"/>
+              </w:rPr>
+              <w:t>${week_5_tasks}</w:t>
+            </w:r>
           </w:p>
         </w:tc>
         <w:tc>
@@ -1151,6 +1365,14 @@
                 <w:szCs w:val="16"/>
               </w:rPr>
             </w:pPr>
+            <w:r>
+              <w:rPr>
+                <w:rFonts w:ascii="Arial" w:eastAsia="Arial" w:hAnsi="Arial" w:cs="Arial"/>
+                <w:sz w:val="16"/>
+                <w:szCs w:val="16"/>
+              </w:rPr>
+              <w:t>${week_5_learned}</w:t>
+            </w:r>
           </w:p>
         </w:tc>
       </w:tr>
@@ -1261,7 +1483,26 @@
                                       <w:color w:val="000000"/>
                                       <w:sz w:val="16"/>
                                     </w:rPr>
-                                    <w:t>___________________________________</w:t>
+                                    <w:t>___________</w:t>
+                                  </w:r>
+                                  <w:r>
+                                    <w:rPr>
+                                      <w:rFonts w:ascii="Arial" w:eastAsia="Arial" w:hAnsi="Arial" w:cs="Arial"/>
+                                      <w:i/>
+                                      <w:color w:val="000000"/>
+                                      <w:sz w:val="16"/>
+                                      <w:u w:val="single"/>
+                                    </w:rPr>
+                                    <w:t>${student_name}</w:t>
+                                  </w:r>
+                                  <w:r>
+                                    <w:rPr>
+                                      <w:rFonts w:ascii="Arial" w:eastAsia="Arial" w:hAnsi="Arial" w:cs="Arial"/>
+                                      <w:i/>
+                                      <w:color w:val="000000"/>
+                                      <w:sz w:val="16"/>
+                                    </w:rPr>
+                                    <w:t>_____________</w:t>
                                   </w:r>
                                 </w:p>
                                 <w:p>
@@ -1343,7 +1584,26 @@
                                 <w:color w:val="000000"/>
                                 <w:sz w:val="16"/>
                               </w:rPr>
-                              <w:t>___________________________________</w:t>
+                              <w:t>___________</w:t>
+                            </w:r>
+                            <w:r>
+                              <w:rPr>
+                                <w:rFonts w:ascii="Arial" w:eastAsia="Arial" w:hAnsi="Arial" w:cs="Arial"/>
+                                <w:i/>
+                                <w:color w:val="000000"/>
+                                <w:sz w:val="16"/>
+                                <w:u w:val="single"/>
+                              </w:rPr>
+                              <w:t>${student_name}</w:t>
+                            </w:r>
+                            <w:r>
+                              <w:rPr>
+                                <w:rFonts w:ascii="Arial" w:eastAsia="Arial" w:hAnsi="Arial" w:cs="Arial"/>
+                                <w:i/>
+                                <w:color w:val="000000"/>
+                                <w:sz w:val="16"/>
+                              </w:rPr>
+                              <w:t>_____________</w:t>
                             </w:r>
                           </w:p>
                           <w:p>
@@ -1504,7 +1764,46 @@
                                       <w:color w:val="000000"/>
                                       <w:sz w:val="16"/>
                                     </w:rPr>
-                                    <w:t>___________________________________</w:t>
+                                    <w:t>_________</w:t>
+                                  </w:r>
+                                  <w:r>
+                                    <w:rPr>
+                                      <w:rFonts w:ascii="Arial" w:eastAsia="Arial" w:hAnsi="Arial" w:cs="Arial"/>
+                                      <w:i/>
+                                      <w:color w:val="000000"/>
+                                      <w:sz w:val="16"/>
+                                      <w:u w:val="single"/>
+                                    </w:rPr>
+                                    <w:t>${s</w:t>
+                                  </w:r>
+                                  <w:r>
+                                    <w:rPr>
+                                      <w:rFonts w:ascii="Arial" w:eastAsia="Arial" w:hAnsi="Arial" w:cs="Arial"/>
+                                      <w:i/>
+                                      <w:color w:val="000000"/>
+                                      <w:sz w:val="16"/>
+                                      <w:u w:val="single"/>
+                                    </w:rPr>
+                                    <w:t>upervisor</w:t>
+                                  </w:r>
+                                  <w:r>
+                                    <w:rPr>
+                                      <w:rFonts w:ascii="Arial" w:eastAsia="Arial" w:hAnsi="Arial" w:cs="Arial"/>
+                                      <w:i/>
+                                      <w:color w:val="000000"/>
+                                      <w:sz w:val="16"/>
+                                      <w:u w:val="single"/>
+                                    </w:rPr>
+                                    <w:t>_name}</w:t>
+                                  </w:r>
+                                  <w:r>
+                                    <w:rPr>
+                                      <w:rFonts w:ascii="Arial" w:eastAsia="Arial" w:hAnsi="Arial" w:cs="Arial"/>
+                                      <w:i/>
+                                      <w:color w:val="000000"/>
+                                      <w:sz w:val="16"/>
+                                    </w:rPr>
+                                    <w:t>__________</w:t>
                                   </w:r>
                                 </w:p>
                                 <w:p>
@@ -1595,7 +1894,46 @@
                                 <w:color w:val="000000"/>
                                 <w:sz w:val="16"/>
                               </w:rPr>
-                              <w:t>___________________________________</w:t>
+                              <w:t>_________</w:t>
+                            </w:r>
+                            <w:r>
+                              <w:rPr>
+                                <w:rFonts w:ascii="Arial" w:eastAsia="Arial" w:hAnsi="Arial" w:cs="Arial"/>
+                                <w:i/>
+                                <w:color w:val="000000"/>
+                                <w:sz w:val="16"/>
+                                <w:u w:val="single"/>
+                              </w:rPr>
+                              <w:t>${s</w:t>
+                            </w:r>
+                            <w:r>
+                              <w:rPr>
+                                <w:rFonts w:ascii="Arial" w:eastAsia="Arial" w:hAnsi="Arial" w:cs="Arial"/>
+                                <w:i/>
+                                <w:color w:val="000000"/>
+                                <w:sz w:val="16"/>
+                                <w:u w:val="single"/>
+                              </w:rPr>
+                              <w:t>upervisor</w:t>
+                            </w:r>
+                            <w:r>
+                              <w:rPr>
+                                <w:rFonts w:ascii="Arial" w:eastAsia="Arial" w:hAnsi="Arial" w:cs="Arial"/>
+                                <w:i/>
+                                <w:color w:val="000000"/>
+                                <w:sz w:val="16"/>
+                                <w:u w:val="single"/>
+                              </w:rPr>
+                              <w:t>_name}</w:t>
+                            </w:r>
+                            <w:r>
+                              <w:rPr>
+                                <w:rFonts w:ascii="Arial" w:eastAsia="Arial" w:hAnsi="Arial" w:cs="Arial"/>
+                                <w:i/>
+                                <w:color w:val="000000"/>
+                                <w:sz w:val="16"/>
+                              </w:rPr>
+                              <w:t>__________</w:t>
                             </w:r>
                           </w:p>
                           <w:p>

</xml_diff>